<commit_message>
Make employer forms package duplex-print reliably
The Word file now starts each form on an odd page via section type
(oddPage) instead of hard-coded blank pages, and no longer restarts
page numbering per section — both interacted badly with duplex printer
drivers when Word repaginated, producing extra blank sheets. The PDF
keeps explicit blank backsides since PDFs print as flat pages.

Co-Authored-By: Claude Fable 5 <noreply@anthropic.com>
Claude-Session: https://claude.ai/code/session_01AmWYG9kjmQZRP6t92aRL6s
</commit_message>
<xml_diff>
--- a/public/documents/Employer Forms Package.docx
+++ b/public/documents/Employer Forms Package.docx
@@ -2579,34 +2579,6 @@
     </w:p>
     <w:p>
       <w:pPr>
-        <w:spacing w:before="0" w:after="0"/>
-        <w:rPr>
-          <w:sz w:val="2"/>
-        </w:rPr>
-      </w:pPr>
-      <w:r>
-        <w:rPr>
-          <w:sz w:val="2"/>
-        </w:rPr>
-        <w:br w:type="page"/>
-      </w:r>
-    </w:p>
-    <w:p>
-      <w:pPr>
-        <w:spacing w:before="0" w:after="0"/>
-        <w:rPr>
-          <w:sz w:val="2"/>
-        </w:rPr>
-      </w:pPr>
-      <w:r>
-        <w:rPr>
-          <w:sz w:val="2"/>
-        </w:rPr>
-        <w:t xml:space="preserve"> </w:t>
-      </w:r>
-    </w:p>
-    <w:p>
-      <w:pPr>
         <w:spacing w:after="0" w:line="240" w:lineRule="auto"/>
         <w:rPr>
           <w:sz w:val="2"/>
@@ -2617,9 +2589,9 @@
           <w:headerReference r:id="rIdHdrMain" w:type="first"/>
           <w:footerReference r:id="rIdFtrBlank" w:type="default"/>
           <w:footerReference r:id="rIdFtrMain" w:type="first"/>
+          <w:type w:val="oddPage"/>
           <w:pgSz w:h="15840" w:w="12240" w:orient="portrait"/>
           <w:pgMar w:bottom="720" w:top="720" w:left="720" w:right="720" w:header="360" w:footer="288"/>
-          <w:pgNumType w:start="1"/>
           <w:titlePg w:val="1"/>
         </w:sectPr>
       </w:pPr>
@@ -3844,34 +3816,6 @@
     </w:p>
     <w:p>
       <w:pPr>
-        <w:spacing w:before="0" w:after="0"/>
-        <w:rPr>
-          <w:sz w:val="2"/>
-        </w:rPr>
-      </w:pPr>
-      <w:r>
-        <w:rPr>
-          <w:sz w:val="2"/>
-        </w:rPr>
-        <w:br w:type="page"/>
-      </w:r>
-    </w:p>
-    <w:p>
-      <w:pPr>
-        <w:spacing w:before="0" w:after="0"/>
-        <w:rPr>
-          <w:sz w:val="2"/>
-        </w:rPr>
-      </w:pPr>
-      <w:r>
-        <w:rPr>
-          <w:sz w:val="2"/>
-        </w:rPr>
-        <w:t xml:space="preserve"> </w:t>
-      </w:r>
-    </w:p>
-    <w:p>
-      <w:pPr>
         <w:spacing w:after="0" w:line="240" w:lineRule="auto"/>
         <w:rPr>
           <w:sz w:val="2"/>
@@ -3882,9 +3826,9 @@
           <w:headerReference r:id="rIdHdrMain" w:type="first"/>
           <w:footerReference r:id="rIdFtrBlank" w:type="default"/>
           <w:footerReference r:id="rIdFtrMain" w:type="first"/>
+          <w:type w:val="oddPage"/>
           <w:pgSz w:h="15840" w:w="12240" w:orient="portrait"/>
           <w:pgMar w:bottom="720" w:top="720" w:left="720" w:right="720" w:header="360" w:footer="288"/>
-          <w:pgNumType w:start="1"/>
           <w:titlePg w:val="1"/>
         </w:sectPr>
       </w:pPr>
@@ -4986,34 +4930,6 @@
     </w:p>
     <w:p>
       <w:pPr>
-        <w:spacing w:before="0" w:after="0"/>
-        <w:rPr>
-          <w:sz w:val="2"/>
-        </w:rPr>
-      </w:pPr>
-      <w:r>
-        <w:rPr>
-          <w:sz w:val="2"/>
-        </w:rPr>
-        <w:br w:type="page"/>
-      </w:r>
-    </w:p>
-    <w:p>
-      <w:pPr>
-        <w:spacing w:before="0" w:after="0"/>
-        <w:rPr>
-          <w:sz w:val="2"/>
-        </w:rPr>
-      </w:pPr>
-      <w:r>
-        <w:rPr>
-          <w:sz w:val="2"/>
-        </w:rPr>
-        <w:t xml:space="preserve"> </w:t>
-      </w:r>
-    </w:p>
-    <w:p>
-      <w:pPr>
         <w:spacing w:after="0" w:line="240" w:lineRule="auto"/>
         <w:rPr>
           <w:sz w:val="2"/>
@@ -5024,9 +4940,9 @@
           <w:headerReference r:id="rIdHdrMain" w:type="first"/>
           <w:footerReference r:id="rIdFtrBlank" w:type="default"/>
           <w:footerReference r:id="rIdFtrMain" w:type="first"/>
+          <w:type w:val="oddPage"/>
           <w:pgSz w:h="15840" w:w="12240" w:orient="portrait"/>
           <w:pgMar w:bottom="720" w:top="1440" w:left="1267" w:right="994" w:header="360" w:footer="288"/>
-          <w:pgNumType w:start="1"/>
           <w:titlePg w:val="1"/>
         </w:sectPr>
       </w:pPr>
@@ -7641,9 +7557,9 @@
           <w:headerReference r:id="rIdHdrMain" w:type="first"/>
           <w:footerReference r:id="rIdFtrBlank" w:type="default"/>
           <w:footerReference r:id="rIdFtrMain" w:type="first"/>
+          <w:type w:val="oddPage"/>
           <w:pgSz w:h="15840" w:w="12240" w:orient="portrait"/>
           <w:pgMar w:bottom="720" w:top="720" w:left="720" w:right="720" w:header="360" w:footer="288"/>
-          <w:pgNumType w:start="1"/>
           <w:titlePg w:val="1"/>
         </w:sectPr>
       </w:pPr>
@@ -11479,9 +11395,9 @@
       <w:headerReference r:id="rIdHdrMain" w:type="first"/>
       <w:footerReference r:id="rIdFtrBlank" w:type="default"/>
       <w:footerReference r:id="rIdFtrMain" w:type="first"/>
+      <w:type w:val="oddPage"/>
       <w:pgSz w:h="15840" w:w="12240" w:orient="portrait"/>
       <w:pgMar w:bottom="720" w:top="720" w:left="1440" w:right="1440" w:header="360" w:footer="288"/>
-      <w:pgNumType w:start="1"/>
       <w:titlePg w:val="1"/>
     </w:sectPr>
   </w:body>

</xml_diff>